<commit_message>
Fix: cleaned up files in folder to improve submission clarity
</commit_message>
<xml_diff>
--- a/Homework 1 Summary.pdf.docx
+++ b/Homework 1 Summary.pdf.docx
@@ -6,107 +6,99 @@
       <w:r>
         <w:t xml:space="preserve">Ellen Hill – CPSC 224 – Homework </w:t>
       </w:r>
-      <w:proofErr w:type="gramStart"/>
-      <w:r>
-        <w:t>1 :</w:t>
-      </w:r>
-      <w:proofErr w:type="gramEnd"/>
-      <w:r>
-        <w:t xml:space="preserve"> Farkle Summary</w:t>
+      <w:r>
+        <w:t>2</w:t>
+      </w:r>
+      <w:r>
+        <w:t xml:space="preserve"> : Farkle </w:t>
+      </w:r>
+      <w:r>
+        <w:t>Rerolling and Niceties</w:t>
       </w:r>
     </w:p>
     <w:p>
       <w:r>
         <w:tab/>
-        <w:t xml:space="preserve">The intent of this project was to expose students to Java by translating a program from C++ into Java. We used </w:t>
-      </w:r>
-      <w:proofErr w:type="gramStart"/>
-      <w:r>
-        <w:t>Farkle,  a</w:t>
-      </w:r>
-      <w:proofErr w:type="gramEnd"/>
-      <w:r>
-        <w:t xml:space="preserve"> </w:t>
-      </w:r>
-      <w:proofErr w:type="gramStart"/>
-      <w:r>
-        <w:t>luck based</w:t>
-      </w:r>
-      <w:proofErr w:type="gramEnd"/>
-      <w:r>
-        <w:t xml:space="preserve"> dice rolling numbers game, as the case for this. We were given the C++ application written by Professor Crandle to go </w:t>
-      </w:r>
-      <w:proofErr w:type="gramStart"/>
-      <w:r>
-        <w:t>off of</w:t>
-      </w:r>
-      <w:proofErr w:type="gramEnd"/>
-      <w:r>
-        <w:t>, and I referenced it side by side while coding my Java application.</w:t>
+        <w:t xml:space="preserve">The intent of this project was to </w:t>
+      </w:r>
+      <w:r>
+        <w:t xml:space="preserve">build upon our work from the first homework, adding in new features and loops to our code to improve the experience for players. We were required to add a game banner, a player name, the option to early quit, rolling </w:t>
+      </w:r>
+      <w:proofErr w:type="spellStart"/>
+      <w:r>
+        <w:t>unmelded</w:t>
+      </w:r>
+      <w:proofErr w:type="spellEnd"/>
+      <w:r>
+        <w:t xml:space="preserve"> dice, hand handle the hot hands rules for Farkle.</w:t>
       </w:r>
     </w:p>
     <w:p>
       <w:r>
         <w:tab/>
-        <w:t xml:space="preserve">My coding style Is to write the program all in main to ensure it works before breaking it up into classes, cleaning up main and keeping the project concise. Unfortunately, I never got to that part so my project is still in main (which is why you will not find any diagram attached). </w:t>
+        <w:t xml:space="preserve">My coding style Is to write the program all in main to ensure it works </w:t>
+      </w:r>
+      <w:r>
+        <w:t>with all of the variables available so I don’t have to worry about scope. This time, I started my work by classifying many of my functions from before and it made my main so much cleaner! It became easier to debug once most of the printing was outsourced to printing functions. k</w:t>
+      </w:r>
+      <w:r>
+        <w:t xml:space="preserve">eeping the project concise. </w:t>
+      </w:r>
+      <w:r>
+        <w:t>I would be interested to see how other people split up their code and functions, especially the loops because those got really confusing!</w:t>
+      </w:r>
+      <w:r>
+        <w:t xml:space="preserve"> </w:t>
       </w:r>
     </w:p>
     <w:p>
       <w:r>
         <w:tab/>
-        <w:t xml:space="preserve">The scoring loop gave me the most trouble, as it is a complex system of for loops and if statements. I was never able to get it to </w:t>
-      </w:r>
-      <w:proofErr w:type="gramStart"/>
-      <w:r>
-        <w:t>work, but</w:t>
-      </w:r>
-      <w:proofErr w:type="gramEnd"/>
-      <w:r>
-        <w:t xml:space="preserve"> </w:t>
-      </w:r>
-      <w:proofErr w:type="gramStart"/>
-      <w:r>
-        <w:t>am able to</w:t>
-      </w:r>
-      <w:proofErr w:type="gramEnd"/>
-      <w:r>
-        <w:t xml:space="preserve"> see the UI that is coded and the various numbers that are generated as dice. As I jokingly commented as I submitted it, “At least the people who decide they don’t want to play get what they want”.  I also had no exposure to Java before this, so I spent a lot of time checking syntax and asking </w:t>
-      </w:r>
-      <w:proofErr w:type="gramStart"/>
-      <w:r>
-        <w:t>really dumb</w:t>
-      </w:r>
-      <w:proofErr w:type="gramEnd"/>
-      <w:r>
-        <w:t xml:space="preserve"> questions to people much more experienced than me.</w:t>
+        <w:t xml:space="preserve">The </w:t>
+      </w:r>
+      <w:r>
+        <w:t>hot hands handling was more complex then I gave it credit for, especially when I started addressing bugs that I didn’t notice last time. Hot hands needed to trigger both for R and K buttons, which led me to discover that I wasn’t checking for a valid meld to enable rerolling. That process took a bit and there was a lot of confusion about which brackets it needed to be between… experimentation for the win!</w:t>
       </w:r>
     </w:p>
     <w:p>
       <w:r>
         <w:tab/>
-        <w:t xml:space="preserve">If I’d had more time, I wish I could have gotten the project to </w:t>
-      </w:r>
-      <w:proofErr w:type="gramStart"/>
-      <w:r>
-        <w:t>work, and</w:t>
-      </w:r>
-      <w:proofErr w:type="gramEnd"/>
-      <w:r>
-        <w:t xml:space="preserve"> really understood why Professor Crandle </w:t>
-      </w:r>
-      <w:proofErr w:type="gramStart"/>
-      <w:r>
-        <w:t>build</w:t>
-      </w:r>
-      <w:proofErr w:type="gramEnd"/>
-      <w:r>
-        <w:t xml:space="preserve"> it the way they did. It seems overly complex, but then again maybe it needed to be. I would have liked to break up each of the mechanisms into classes so that main was clean and empty, and I would have liked to review the code for variables that are included in Crandle’s build and then never used. </w:t>
+        <w:t xml:space="preserve">If I’d had more time, </w:t>
+      </w:r>
+      <w:r>
+        <w:t xml:space="preserve">I would have spent more time breaking up my main into functions so that it would be more readable. I was very happy with this project output and found myself address bugs that I would normally let slide. I came into this project with a player focused mindset, so anything that I thought would be frustrating as a player, I tried to address. </w:t>
       </w:r>
     </w:p>
     <w:p>
-      <w:r>
-        <w:tab/>
-        <w:t xml:space="preserve">I discussed with several of my classmates how long this project took them. Several of them said only an hour. If I had done this differently I’d wish to be those people who find this intuitive. </w:t>
+      <w:pPr>
+        <w:ind w:firstLine="720"/>
+      </w:pPr>
+      <w:r>
+        <w:t xml:space="preserve">Very rarely do I spend so much time coding, and even more rarely do I enjoy it as much as I did this time </w:t>
+      </w:r>
+      <w:r>
+        <w:rPr>
+          <mc:AlternateContent>
+            <mc:Choice Requires="w16se"/>
+            <mc:Fallback>
+              <w:rFonts w:ascii="Segoe UI Emoji" w:eastAsia="Segoe UI Emoji" w:hAnsi="Segoe UI Emoji" w:cs="Segoe UI Emoji"/>
+            </mc:Fallback>
+          </mc:AlternateContent>
+        </w:rPr>
+        <mc:AlternateContent>
+          <mc:Choice Requires="w16se">
+            <w16se:symEx w16se:font="Segoe UI Emoji" w16se:char="1F60A"/>
+          </mc:Choice>
+          <mc:Fallback>
+            <w:t>😊</w:t>
+          </mc:Fallback>
+        </mc:AlternateContent>
+      </w:r>
+      <w:r>
+        <w:t xml:space="preserve"> yay! </w:t>
+      </w:r>
+      <w:r>
+        <w:t xml:space="preserve"> </w:t>
       </w:r>
     </w:p>
     <w:sectPr>

</xml_diff>